<commit_message>
Productos, mapa y estilos finales
</commit_message>
<xml_diff>
--- a/Andrés Felipe Echeverri Gómez.docx
+++ b/Andrés Felipe Echeverri Gómez.docx
@@ -4,7 +4,14 @@
   <w:body>
     <w:p>
       <w:pPr>
+        <w:autoSpaceDE w:val="0"/>
+        <w:autoSpaceDN w:val="0"/>
+        <w:adjustRightInd w:val="0"/>
+        <w:spacing w:after="0" w:line="240" w:lineRule="auto"/>
         <w:rPr>
+          <w:rFonts w:ascii="Lucida Console" w:hAnsi="Lucida Console" w:cs="Lucida Console"/>
+          <w:sz w:val="18"/>
+          <w:szCs w:val="18"/>
           <w:lang w:val="es-CO"/>
         </w:rPr>
       </w:pPr>
@@ -48,7 +55,24 @@
         <w:br/>
       </w:r>
       <w:bookmarkStart w:id="0" w:name="_GoBack"/>
+      <w:r>
+        <w:rPr>
+          <w:rFonts w:ascii="Lucida Console" w:hAnsi="Lucida Console" w:cs="Lucida Console"/>
+          <w:sz w:val="18"/>
+          <w:szCs w:val="18"/>
+          <w:lang w:val="es-CO"/>
+        </w:rPr>
+        <w:t>https://github.com/andresecheverri894-a11y/evaluacion-html.git</w:t>
+      </w:r>
       <w:bookmarkEnd w:id="0"/>
+    </w:p>
+    <w:p>
+      <w:pPr>
+        <w:rPr>
+          <w:u w:val="single"/>
+          <w:lang w:val="es-CO"/>
+        </w:rPr>
+      </w:pPr>
     </w:p>
     <w:sectPr>
       <w:pgSz w:w="12240" w:h="15840"/>

</xml_diff>